<commit_message>
Añadida proforma, nuevas funcionalidades y robustez
</commit_message>
<xml_diff>
--- a/Pedidos/Manual de Usuario AppWeb.docx
+++ b/Pedidos/Manual de Usuario AppWeb.docx
@@ -113,13 +113,25 @@
         <w:t xml:space="preserve">Rev. </w:t>
       </w:r>
       <w:r>
-        <w:t>10/06/2025</w:t>
-      </w:r>
-    </w:p>
-    <w:p>
-      <w:r>
+        <w:t>04</w:t>
+      </w:r>
+      <w:r>
+        <w:t>/</w:t>
+      </w:r>
+      <w:r>
+        <w:t>12</w:t>
+      </w:r>
+      <w:r>
+        <w:t>/2025</w:t>
+      </w:r>
+    </w:p>
+    <w:p>
+      <w:r>
+        <w:rPr>
+          <w:highlight w:val="yellow"/>
+        </w:rPr>
         <w:lastRenderedPageBreak/>
-        <w:t>Requisito previo al acceso a la aplicación de pedidos web:</w:t>
+        <w:t>Requisito previo al acceso a la aplicación de pedidos web</w:t>
       </w:r>
     </w:p>
     <w:p>
@@ -135,6 +147,37 @@
       </w:r>
     </w:p>
     <w:p>
+      <w:pPr>
+        <w:rPr>
+          <w:b/>
+          <w:bCs/>
+        </w:rPr>
+      </w:pPr>
+      <w:r>
+        <w:rPr>
+          <w:b/>
+          <w:bCs/>
+        </w:rPr>
+        <w:t xml:space="preserve">Si le vas a dar uso en un PC, MAC </w:t>
+      </w:r>
+      <w:proofErr w:type="spellStart"/>
+      <w:r>
+        <w:rPr>
+          <w:b/>
+          <w:bCs/>
+        </w:rPr>
+        <w:t>ó</w:t>
+      </w:r>
+      <w:proofErr w:type="spellEnd"/>
+      <w:r>
+        <w:rPr>
+          <w:b/>
+          <w:bCs/>
+        </w:rPr>
+        <w:t xml:space="preserve"> Linux:</w:t>
+      </w:r>
+    </w:p>
+    <w:p>
       <w:r>
         <w:t xml:space="preserve">Descargar la aplicación VPN </w:t>
       </w:r>
@@ -152,14 +195,11 @@
       <w:r>
         <w:t xml:space="preserve">: </w:t>
       </w:r>
-      <w:hyperlink r:id="rId6" w:history="1">
-        <w:r>
-          <w:rPr>
-            <w:rStyle w:val="Hipervnculo"/>
-          </w:rPr>
-          <w:t>https://www.fortinet.com/lat/support/product-downloads</w:t>
-        </w:r>
-      </w:hyperlink>
+    </w:p>
+    <w:p>
+      <w:r>
+        <w:t>https://www.fortinet.com/lat/support/product-downloads#vpn</w:t>
+      </w:r>
     </w:p>
     <w:p>
       <w:r>
@@ -187,7 +227,7 @@
                     <pic:cNvPicPr/>
                   </pic:nvPicPr>
                   <pic:blipFill>
-                    <a:blip r:embed="rId7"/>
+                    <a:blip r:embed="rId6"/>
                     <a:stretch>
                       <a:fillRect/>
                     </a:stretch>
@@ -210,7 +250,71 @@
     </w:p>
     <w:p>
       <w:r>
-        <w:t>Una vez instalada habrá que configurar la conexión desde la opción (pinchando en las 3 rayas) “Adicionar una nueva conexión”</w:t>
+        <w:t>Nota: Dependiendo de la versión que emplees Windows, Mac, Linux… el aspecto de la aplicación VPN puede cambiar, las imágenes que aparecen en este manual se corresponden con la versión de Windows.</w:t>
+      </w:r>
+    </w:p>
+    <w:p/>
+    <w:p>
+      <w:r>
+        <w:rPr>
+          <w:b/>
+          <w:bCs/>
+        </w:rPr>
+        <w:t>Si le vas a dar uso en algún</w:t>
+      </w:r>
+      <w:r>
+        <w:t xml:space="preserve"> </w:t>
+      </w:r>
+      <w:r>
+        <w:rPr>
+          <w:b/>
+          <w:bCs/>
+        </w:rPr>
+        <w:t>dispositivo móvil</w:t>
+      </w:r>
+      <w:r>
+        <w:t xml:space="preserve"> ve a tu </w:t>
+      </w:r>
+      <w:proofErr w:type="spellStart"/>
+      <w:r>
+        <w:t>play</w:t>
+      </w:r>
+      <w:proofErr w:type="spellEnd"/>
+      <w:r>
+        <w:t xml:space="preserve"> store, </w:t>
+      </w:r>
+      <w:proofErr w:type="gramStart"/>
+      <w:r>
+        <w:t>app</w:t>
+      </w:r>
+      <w:proofErr w:type="gramEnd"/>
+      <w:r>
+        <w:t xml:space="preserve"> store, </w:t>
+      </w:r>
+      <w:proofErr w:type="spellStart"/>
+      <w:r>
+        <w:t>etc</w:t>
+      </w:r>
+      <w:proofErr w:type="spellEnd"/>
+      <w:r>
+        <w:t>… busca la aplicación FORTICLIENT VPN e instálala desde ahí.</w:t>
+      </w:r>
+    </w:p>
+    <w:p/>
+    <w:p/>
+    <w:p>
+      <w:r>
+        <w:lastRenderedPageBreak/>
+        <w:t>U</w:t>
+      </w:r>
+      <w:r>
+        <w:t>na vez instalada</w:t>
+      </w:r>
+      <w:r>
+        <w:t xml:space="preserve"> la herramienta VPN</w:t>
+      </w:r>
+      <w:r>
+        <w:t xml:space="preserve"> habrá que configurar la conexión desde la opción (pinchando en las 3 rayas) “Adicionar una nueva conexión”</w:t>
       </w:r>
       <w:r>
         <w:rPr>
@@ -232,7 +336,7 @@
                     <pic:cNvPicPr/>
                   </pic:nvPicPr>
                   <pic:blipFill>
-                    <a:blip r:embed="rId8"/>
+                    <a:blip r:embed="rId7"/>
                     <a:stretch>
                       <a:fillRect/>
                     </a:stretch>
@@ -255,15 +359,15 @@
     </w:p>
     <w:p>
       <w:r>
+        <w:t>Rellenar todos los datos con los que se muestran en la siguiente imagen (en el campo “Nombre de usuario” pondrás el tuyo propio)</w:t>
+      </w:r>
+    </w:p>
+    <w:p>
+      <w:r>
+        <w:rPr>
+          <w:noProof/>
+        </w:rPr>
         <w:lastRenderedPageBreak/>
-        <w:t>Rellenar todos los datos con los que se muestran en la siguiente imagen (en el campo “Nombre de usuario” pondrás el tuyo propio)</w:t>
-      </w:r>
-    </w:p>
-    <w:p>
-      <w:r>
-        <w:rPr>
-          <w:noProof/>
-        </w:rPr>
         <w:drawing>
           <wp:inline distT="0" distB="0" distL="0" distR="0" wp14:anchorId="1347CECC" wp14:editId="2D733BFB">
             <wp:extent cx="5400040" cy="4086225"/>
@@ -280,7 +384,7 @@
                     <pic:cNvPicPr/>
                   </pic:nvPicPr>
                   <pic:blipFill>
-                    <a:blip r:embed="rId9"/>
+                    <a:blip r:embed="rId8"/>
                     <a:stretch>
                       <a:fillRect/>
                     </a:stretch>
@@ -306,10 +410,12 @@
         <w:t xml:space="preserve">Una vez guardados los cambios iremos a la pantalla principal de la aplicación, introduciremos la contraseña y haremos </w:t>
       </w:r>
       <w:proofErr w:type="spellStart"/>
+      <w:proofErr w:type="gramStart"/>
       <w:r>
         <w:t>click</w:t>
       </w:r>
       <w:proofErr w:type="spellEnd"/>
+      <w:proofErr w:type="gramEnd"/>
       <w:r>
         <w:t xml:space="preserve"> en “Conectar”</w:t>
       </w:r>
@@ -333,7 +439,7 @@
                     <pic:cNvPicPr/>
                   </pic:nvPicPr>
                   <pic:blipFill>
-                    <a:blip r:embed="rId10"/>
+                    <a:blip r:embed="rId9"/>
                     <a:stretch>
                       <a:fillRect/>
                     </a:stretch>
@@ -387,7 +493,7 @@
                     <pic:cNvPicPr/>
                   </pic:nvPicPr>
                   <pic:blipFill>
-                    <a:blip r:embed="rId11"/>
+                    <a:blip r:embed="rId10"/>
                     <a:stretch>
                       <a:fillRect/>
                     </a:stretch>
@@ -617,7 +723,7 @@
                     <pic:cNvPicPr/>
                   </pic:nvPicPr>
                   <pic:blipFill>
-                    <a:blip r:embed="rId12"/>
+                    <a:blip r:embed="rId11"/>
                     <a:stretch>
                       <a:fillRect/>
                     </a:stretch>
@@ -833,10 +939,10 @@
         </w:rPr>
         <w:lastRenderedPageBreak/>
         <w:drawing>
-          <wp:inline distT="0" distB="0" distL="0" distR="0" wp14:anchorId="2DBE931F" wp14:editId="67885F8D">
-            <wp:extent cx="5400040" cy="2569845"/>
-            <wp:effectExtent l="0" t="0" r="0" b="1905"/>
-            <wp:docPr id="2104510010" name="Imagen 1" descr="Interfaz de usuario gráfica, Aplicación&#10;&#10;El contenido generado por IA puede ser incorrecto."/>
+          <wp:inline distT="0" distB="0" distL="0" distR="0" wp14:anchorId="24551114" wp14:editId="45D8008F">
+            <wp:extent cx="5400040" cy="2637790"/>
+            <wp:effectExtent l="0" t="0" r="0" b="0"/>
+            <wp:docPr id="249463529" name="Imagen 1" descr="Interfaz de usuario gráfica, Aplicación&#10;&#10;El contenido generado por IA puede ser incorrecto."/>
             <wp:cNvGraphicFramePr>
               <a:graphicFrameLocks xmlns:a="http://schemas.openxmlformats.org/drawingml/2006/main" noChangeAspect="1"/>
             </wp:cNvGraphicFramePr>
@@ -844,11 +950,11 @@
               <a:graphicData uri="http://schemas.openxmlformats.org/drawingml/2006/picture">
                 <pic:pic xmlns:pic="http://schemas.openxmlformats.org/drawingml/2006/picture">
                   <pic:nvPicPr>
-                    <pic:cNvPr id="2104510010" name="Imagen 1" descr="Interfaz de usuario gráfica, Aplicación&#10;&#10;El contenido generado por IA puede ser incorrecto."/>
+                    <pic:cNvPr id="249463529" name="Imagen 1" descr="Interfaz de usuario gráfica, Aplicación&#10;&#10;El contenido generado por IA puede ser incorrecto."/>
                     <pic:cNvPicPr/>
                   </pic:nvPicPr>
                   <pic:blipFill>
-                    <a:blip r:embed="rId13"/>
+                    <a:blip r:embed="rId12"/>
                     <a:stretch>
                       <a:fillRect/>
                     </a:stretch>
@@ -856,7 +962,7 @@
                   <pic:spPr>
                     <a:xfrm>
                       <a:off x="0" y="0"/>
-                      <a:ext cx="5400040" cy="2569845"/>
+                      <a:ext cx="5400040" cy="2637790"/>
                     </a:xfrm>
                     <a:prstGeom prst="rect">
                       <a:avLst/>
@@ -1007,6 +1113,27 @@
     <w:p>
       <w:pPr>
         <w:numPr>
+          <w:ilvl w:val="2"/>
+          <w:numId w:val="3"/>
+        </w:numPr>
+      </w:pPr>
+      <w:r>
+        <w:t xml:space="preserve">Este campo es </w:t>
+      </w:r>
+      <w:r>
+        <w:rPr>
+          <w:b/>
+          <w:bCs/>
+        </w:rPr>
+        <w:t>obligatorio</w:t>
+      </w:r>
+      <w:r>
+        <w:t>.</w:t>
+      </w:r>
+    </w:p>
+    <w:p>
+      <w:pPr>
+        <w:numPr>
           <w:ilvl w:val="1"/>
           <w:numId w:val="3"/>
         </w:numPr>
@@ -1023,7 +1150,7 @@
           <w:b/>
           <w:bCs/>
         </w:rPr>
-        <w:t>Expedición</w:t>
+        <w:t>Entrega</w:t>
       </w:r>
       <w:r>
         <w:rPr>
@@ -1033,7 +1160,7 @@
         <w:t>:</w:t>
       </w:r>
       <w:r>
-        <w:t xml:space="preserve"> (Opcional) Selecciona la fecha en la que este pedido </w:t>
+        <w:t xml:space="preserve">  Selecciona la fecha en la que este pedido </w:t>
       </w:r>
       <w:r>
         <w:t>se haya de entregar</w:t>
@@ -1063,6 +1190,25 @@
     <w:p>
       <w:pPr>
         <w:numPr>
+          <w:ilvl w:val="1"/>
+          <w:numId w:val="3"/>
+        </w:numPr>
+      </w:pPr>
+      <w:r>
+        <w:rPr>
+          <w:b/>
+          <w:bCs/>
+        </w:rPr>
+        <w:lastRenderedPageBreak/>
+        <w:t>Descuento General:</w:t>
+      </w:r>
+      <w:r>
+        <w:t xml:space="preserve"> Puedes incluir un descuento general (valor porcentual) que aplicará a la totalidad del pedido.</w:t>
+      </w:r>
+    </w:p>
+    <w:p>
+      <w:pPr>
+        <w:numPr>
           <w:ilvl w:val="0"/>
           <w:numId w:val="3"/>
         </w:numPr>
@@ -1072,7 +1218,6 @@
           <w:b/>
           <w:bCs/>
         </w:rPr>
-        <w:lastRenderedPageBreak/>
         <w:t>Sección "Líneas del Pedido":</w:t>
       </w:r>
       <w:r>
@@ -1332,6 +1477,46 @@
           <w:ilvl w:val="2"/>
           <w:numId w:val="3"/>
         </w:numPr>
+        <w:rPr>
+          <w:b/>
+          <w:bCs/>
+        </w:rPr>
+      </w:pPr>
+      <w:r>
+        <w:rPr>
+          <w:b/>
+          <w:bCs/>
+        </w:rPr>
+        <w:t>Dto. Adicional</w:t>
+      </w:r>
+      <w:r>
+        <w:rPr>
+          <w:b/>
+          <w:bCs/>
+        </w:rPr>
+        <w:t>:</w:t>
+      </w:r>
+    </w:p>
+    <w:p>
+      <w:pPr>
+        <w:numPr>
+          <w:ilvl w:val="3"/>
+          <w:numId w:val="3"/>
+        </w:numPr>
+      </w:pPr>
+      <w:r>
+        <w:t xml:space="preserve">Puedes incluir un descuento adicional </w:t>
+      </w:r>
+      <w:r>
+        <w:t>que se aplicará únicamente a la línea correspondiente.</w:t>
+      </w:r>
+    </w:p>
+    <w:p>
+      <w:pPr>
+        <w:numPr>
+          <w:ilvl w:val="2"/>
+          <w:numId w:val="3"/>
+        </w:numPr>
       </w:pPr>
       <w:r>
         <w:rPr>
@@ -1356,6 +1541,7 @@
           <w:b/>
           <w:bCs/>
         </w:rPr>
+        <w:lastRenderedPageBreak/>
         <w:t>Botón "Añadir Línea":</w:t>
       </w:r>
       <w:r>
@@ -1393,7 +1579,6 @@
           <w:b/>
           <w:bCs/>
         </w:rPr>
-        <w:lastRenderedPageBreak/>
         <w:t>Total</w:t>
       </w:r>
       <w:proofErr w:type="gramEnd"/>
@@ -1546,6 +1731,7 @@
         <w:rPr>
           <w:noProof/>
         </w:rPr>
+        <w:lastRenderedPageBreak/>
         <w:drawing>
           <wp:inline distT="0" distB="0" distL="0" distR="0" wp14:anchorId="6FA8845A" wp14:editId="3E400203">
             <wp:extent cx="5400040" cy="2226945"/>
@@ -1562,7 +1748,7 @@
                     <pic:cNvPicPr/>
                   </pic:nvPicPr>
                   <pic:blipFill>
-                    <a:blip r:embed="rId14"/>
+                    <a:blip r:embed="rId13"/>
                     <a:stretch>
                       <a:fillRect/>
                     </a:stretch>
@@ -1644,7 +1830,6 @@
         </w:numPr>
       </w:pPr>
       <w:r>
-        <w:lastRenderedPageBreak/>
         <w:t>Desde esta pantalla, puedes:</w:t>
       </w:r>
     </w:p>
@@ -1667,17 +1852,19 @@
         </w:numPr>
       </w:pPr>
       <w:r>
-        <w:t xml:space="preserve">Si el pedido </w:t>
-      </w:r>
-      <w:r>
-        <w:rPr>
-          <w:b/>
-          <w:bCs/>
-        </w:rPr>
-        <w:t>no</w:t>
-      </w:r>
-      <w:r>
-        <w:t xml:space="preserve"> tiene el estado 'PROCESADO', también verás un botón para "Editar este Pedido", que te llevará al formulario de edición.</w:t>
+        <w:t>Si el pedido tiene el estado '</w:t>
+      </w:r>
+      <w:r>
+        <w:t>PENDIENTE</w:t>
+      </w:r>
+      <w:r>
+        <w:t>'</w:t>
+      </w:r>
+      <w:r>
+        <w:t xml:space="preserve"> o ‘BORRADOR’</w:t>
+      </w:r>
+      <w:r>
+        <w:t>, también verás un botón para "Editar este Pedido", que te llevará al formulario de edición.</w:t>
       </w:r>
     </w:p>
     <w:p>
@@ -1709,10 +1896,10 @@
           <w:noProof/>
         </w:rPr>
         <w:drawing>
-          <wp:inline distT="0" distB="0" distL="0" distR="0" wp14:anchorId="7F84A63C" wp14:editId="6CD8B549">
-            <wp:extent cx="5400040" cy="2631440"/>
+          <wp:inline distT="0" distB="0" distL="0" distR="0" wp14:anchorId="5DFFB165" wp14:editId="3B69D528">
+            <wp:extent cx="5400040" cy="2572385"/>
             <wp:effectExtent l="0" t="0" r="0" b="0"/>
-            <wp:docPr id="1936963651" name="Imagen 1" descr="Interfaz de usuario gráfica, Texto, Aplicación, Correo electrónico&#10;&#10;El contenido generado por IA puede ser incorrecto."/>
+            <wp:docPr id="1898030623" name="Imagen 1" descr="Interfaz de usuario gráfica, Texto, Aplicación&#10;&#10;El contenido generado por IA puede ser incorrecto."/>
             <wp:cNvGraphicFramePr>
               <a:graphicFrameLocks xmlns:a="http://schemas.openxmlformats.org/drawingml/2006/main" noChangeAspect="1"/>
             </wp:cNvGraphicFramePr>
@@ -1720,11 +1907,11 @@
               <a:graphicData uri="http://schemas.openxmlformats.org/drawingml/2006/picture">
                 <pic:pic xmlns:pic="http://schemas.openxmlformats.org/drawingml/2006/picture">
                   <pic:nvPicPr>
-                    <pic:cNvPr id="1936963651" name="Imagen 1" descr="Interfaz de usuario gráfica, Texto, Aplicación, Correo electrónico&#10;&#10;El contenido generado por IA puede ser incorrecto."/>
+                    <pic:cNvPr id="1898030623" name="Imagen 1" descr="Interfaz de usuario gráfica, Texto, Aplicación&#10;&#10;El contenido generado por IA puede ser incorrecto."/>
                     <pic:cNvPicPr/>
                   </pic:nvPicPr>
                   <pic:blipFill>
-                    <a:blip r:embed="rId15"/>
+                    <a:blip r:embed="rId14"/>
                     <a:stretch>
                       <a:fillRect/>
                     </a:stretch>
@@ -1732,7 +1919,7 @@
                   <pic:spPr>
                     <a:xfrm>
                       <a:off x="0" y="0"/>
-                      <a:ext cx="5400040" cy="2631440"/>
+                      <a:ext cx="5400040" cy="2572385"/>
                     </a:xfrm>
                     <a:prstGeom prst="rect">
                       <a:avLst/>
@@ -1747,17 +1934,13 @@
     </w:p>
     <w:p>
       <w:r>
-        <w:t xml:space="preserve">En la lista "Mis Pedidos", si un pedido </w:t>
-      </w:r>
-      <w:r>
-        <w:rPr>
-          <w:b/>
-          <w:bCs/>
-        </w:rPr>
-        <w:t>NO</w:t>
-      </w:r>
-      <w:r>
-        <w:t xml:space="preserve"> tiene el estado 'PROCESADO', verás un botón </w:t>
+        <w:t>En la lista "Mis Pedidos", si un pedido tiene el estado '</w:t>
+      </w:r>
+      <w:r>
+        <w:t>PENDIENTE’ o ‘BORRADOR’</w:t>
+      </w:r>
+      <w:r>
+        <w:t xml:space="preserve"> verás un botón </w:t>
       </w:r>
       <w:r>
         <w:rPr>
@@ -1784,6 +1967,7 @@
         </w:numPr>
       </w:pPr>
       <w:r>
+        <w:lastRenderedPageBreak/>
         <w:t>Haz clic en este botón para abrir el pedido en el formulario de edición.</w:t>
       </w:r>
     </w:p>
@@ -1907,7 +2091,6 @@
         </w:numPr>
       </w:pPr>
       <w:r>
-        <w:lastRenderedPageBreak/>
         <w:t xml:space="preserve">Se aplicarán las mismas validaciones que al crear un nuevo pedido (múltiplos de UD. </w:t>
       </w:r>
       <w:proofErr w:type="spellStart"/>
@@ -2075,6 +2258,7 @@
         </w:numPr>
       </w:pPr>
       <w:r>
+        <w:lastRenderedPageBreak/>
         <w:t xml:space="preserve">Aparecerá un mensaje de confirmación preguntando si realmente deseas eliminar todo el pedido. Esta acción </w:t>
       </w:r>
       <w:r>

</xml_diff>